<commit_message>
Updated project_overview.docx with latest features
</commit_message>
<xml_diff>
--- a/project_overview.docx
+++ b/project_overview.docx
@@ -75,6 +75,21 @@
       </w:r>
       <w:r>
         <w:t xml:space="preserve"> 👉 [app-release.apk](file:///d:/Quran/build/app/outputs/flutter-apk/app-release.apk) (36.3 MB)</w:t>
+      </w:r>
+    </w:p>
+    <w:p>
+      <w:pPr>
+        <w:spacing w:after="120"/>
+      </w:pPr>
+      <w:r/>
+      <w:r>
+        <w:rPr>
+          <w:b/>
+        </w:rPr>
+        <w:t>GitHub Repository:</w:t>
+      </w:r>
+      <w:r>
+        <w:t xml:space="preserve"> [mashkurulalamohi37/quran](https://github.com/mashkurulalamohi37/quran.git)</w:t>
       </w:r>
     </w:p>
     <w:p>
@@ -420,10 +435,10 @@
         <w:rPr>
           <w:b/>
         </w:rPr>
-        <w:t>Janazah &amp; Tasbih:</w:t>
+        <w:t>Namaj Shikha, Janazah &amp; Tasbih:</w:t>
       </w:r>
       <w:r>
-        <w:t xml:space="preserve"> Step-by-step funeral prayer guides and a digital dhikr counter.</w:t>
+        <w:t xml:space="preserve"> A complete guide on Wudu steps, prayer postures, necessary Quranic Suras &amp; Duas, and a digital dhikr counter.</w:t>
       </w:r>
     </w:p>
     <w:p>

</xml_diff>